<commit_message>
Added content to system elements
also a little bit of the conclusion
</commit_message>
<xml_diff>
--- a/Final Report.docx
+++ b/Final Report.docx
@@ -2,6 +2,84 @@
 <file path=word/document.xml><?xml version="1.0" encoding="utf-8"?>
 <w:document xmlns:wpc="http://schemas.microsoft.com/office/word/2010/wordprocessingCanvas" xmlns:cx="http://schemas.microsoft.com/office/drawing/2014/chartex" xmlns:cx1="http://schemas.microsoft.com/office/drawing/2015/9/8/chartex" xmlns:cx2="http://schemas.microsoft.com/office/drawing/2015/10/21/chartex" xmlns:cx3="http://schemas.microsoft.com/office/drawing/2016/5/9/chartex" xmlns:cx4="http://schemas.microsoft.com/office/drawing/2016/5/10/chartex" xmlns:cx5="http://schemas.microsoft.com/office/drawing/2016/5/11/chartex" xmlns:cx6="http://schemas.microsoft.com/office/drawing/2016/5/12/chartex" xmlns:cx7="http://schemas.microsoft.com/office/drawing/2016/5/13/chartex" xmlns:cx8="http://schemas.microsoft.com/office/drawing/2016/5/14/chartex" xmlns:mc="http://schemas.openxmlformats.org/markup-compatibility/2006" xmlns:aink="http://schemas.microsoft.com/office/drawing/2016/ink" xmlns:am3d="http://schemas.microsoft.com/office/drawing/2017/model3d" xmlns:o="urn:schemas-microsoft-com:office:office" xmlns:oel="http://schemas.microsoft.com/office/2019/extlst" xmlns:r="http://schemas.openxmlformats.org/officeDocument/2006/relationships" xmlns:m="http://schemas.openxmlformats.org/officeDocument/2006/math" xmlns:v="urn:schemas-microsoft-com:vml" xmlns:wp14="http://schemas.microsoft.com/office/word/2010/wordprocessingDrawing" xmlns:wp="http://schemas.openxmlformats.org/drawingml/2006/wordprocessingDrawing" xmlns:w10="urn:schemas-microsoft-com:office:word" xmlns:w="http://schemas.openxmlformats.org/wordprocessingml/2006/main" xmlns:w14="http://schemas.microsoft.com/office/word/2010/wordml" xmlns:w15="http://schemas.microsoft.com/office/word/2012/wordml" xmlns:w16cex="http://schemas.microsoft.com/office/word/2018/wordml/cex" xmlns:w16cid="http://schemas.microsoft.com/office/word/2016/wordml/cid" xmlns:w16="http://schemas.microsoft.com/office/word/2018/wordml" xmlns:w16du="http://schemas.microsoft.com/office/word/2023/wordml/word16du" xmlns:w16sdtdh="http://schemas.microsoft.com/office/word/2020/wordml/sdtdatahash" xmlns:w16sdtfl="http://schemas.microsoft.com/office/word/2024/wordml/sdtformatlock" xmlns:w16se="http://schemas.microsoft.com/office/word/2015/wordml/symex" xmlns:wpg="http://schemas.microsoft.com/office/word/2010/wordprocessingGroup" xmlns:wpi="http://schemas.microsoft.com/office/word/2010/wordprocessingInk" xmlns:wne="http://schemas.microsoft.com/office/word/2006/wordml" xmlns:wps="http://schemas.microsoft.com/office/word/2010/wordprocessingShape" mc:Ignorable="w14 w15 w16se w16cid w16 w16cex w16sdtdh w16sdtfl w16du wp14">
   <w:body>
+    <w:p>
+      <w:pPr>
+        <w:spacing w:before="1080"/>
+      </w:pPr>
+      <w:r>
+        <w:t>Final Group Report</w:t>
+      </w:r>
+    </w:p>
+    <w:p>
+      <w:r>
+        <w:t>Abstract</w:t>
+      </w:r>
+    </w:p>
+    <w:p>
+      <w:r>
+        <w:t>Introduction</w:t>
+      </w:r>
+    </w:p>
+    <w:p>
+      <w:r>
+        <w:t>System elements</w:t>
+      </w:r>
+    </w:p>
+    <w:p>
+      <w:r>
+        <w:t>Our buggy has an IR sensor for line following, which is the main aim of our final project. It follows the line by taking in 3 different readings: outside of the line to the left, outside of the line to the right, and on the line. The IR sensor had 7 pins, 5 of which were connected the remaining two pins were for LDR which was already part of a voltage divider, all pins were connected using female-to-male wires to the breadboard and then to the Arduino using wires. The 5V pin was connected to the 5V pin on the Arduino, GND was to GND. Ch1, Ch2 and Ch3 were connected to A5, A4 and A3 respectively.  The light following in our robot, was done using voltage divider circuit with two LDRs and connected to the analogue pins. The ultrasonic distance sensor</w:t>
+      </w:r>
+      <w:r>
+        <w:t xml:space="preserve"> sends out high-frequency sounds, which are converted into distance through the code. </w:t>
+      </w:r>
+      <w:r>
+        <w:t xml:space="preserve">It had 4 pins: Trig, Echo, GND and VCC. These were connected to digital pin 11, digital pin 12, GND and 5V. </w:t>
+      </w:r>
+      <w:r>
+        <w:t>We used this distance to create collision avoidance so when an object Infront of the sensor is detected it stops immediately until the object is removed or the buggy is moved.</w:t>
+      </w:r>
+      <w:r>
+        <w:t xml:space="preserve"> </w:t>
+      </w:r>
+      <w:r>
+        <w:t xml:space="preserve">We also added the I2C sensor, which detects light. </w:t>
+      </w:r>
+    </w:p>
+    <w:p>
+      <w:r>
+        <w:t>Final performance</w:t>
+      </w:r>
+    </w:p>
+    <w:p>
+      <w:r>
+        <w:t>The buggy can move on a black</w:t>
+      </w:r>
+      <w:r>
+        <w:t xml:space="preserve"> </w:t>
+      </w:r>
+      <w:r>
+        <w:t>rectangle with sharp and rounded edges. It can successfully detect objects of different colours and stop. Sometimes the light-following does not work as intended</w:t>
+      </w:r>
+      <w:r>
+        <w:t xml:space="preserve">, </w:t>
+      </w:r>
+      <w:r>
+        <w:t>there is a delayed response with the following, possibly has to do with the LDR.</w:t>
+      </w:r>
+    </w:p>
+    <w:p>
+      <w:r>
+        <w:t>Conclusions</w:t>
+      </w:r>
+    </w:p>
+    <w:p>
+      <w:r>
+        <w:t xml:space="preserve">All sensors work as intended. The only issue being most require the same number of pins, which our Arduino cannot accommodate at the same time. Some of the wires had to be removed for other sensors to work. </w:t>
+      </w:r>
+      <w:r>
+        <w:t>Since all sensors used their own code to be functional, each time our sensor was being tested we had to reupload code after changes were made, or different code for different sensors were uploaded.</w:t>
+      </w:r>
+    </w:p>
     <w:p/>
     <w:sectPr>
       <w:pgSz w:w="11906" w:h="16838"/>
@@ -413,6 +491,7 @@
   <w:style w:type="paragraph" w:default="1" w:styleId="Normal">
     <w:name w:val="Normal"/>
     <w:qFormat/>
+    <w:rsid w:val="008C2A1A"/>
   </w:style>
   <w:style w:type="paragraph" w:styleId="Heading1">
     <w:name w:val="heading 1"/>

</xml_diff>

<commit_message>
Added more content to the file
</commit_message>
<xml_diff>
--- a/Final Report.docx
+++ b/Final Report.docx
@@ -17,67 +17,82 @@
     </w:p>
     <w:p>
       <w:r>
-        <w:t>Introduction</w:t>
+        <w:t>The buggy has features including line-following, collision avoidance and light-following. We made use of the IR sensor, I2C sensor and Ultrasonic distance sensor. The wiring was done neatly to ensure that the connections could be understood by a third-party.</w:t>
       </w:r>
     </w:p>
     <w:p>
       <w:r>
-        <w:t>System elements</w:t>
+        <w:t>Introduction</w:t>
       </w:r>
     </w:p>
     <w:p>
       <w:r>
-        <w:t>Our buggy has an IR sensor for line following, which is the main aim of our final project. It follows the line by taking in 3 different readings: outside of the line to the left, outside of the line to the right, and on the line. The IR sensor had 7 pins, 5 of which were connected the remaining two pins were for LDR which was already part of a voltage divider, all pins were connected using female-to-male wires to the breadboard and then to the Arduino using wires. The 5V pin was connected to the 5V pin on the Arduino, GND was to GND. Ch1, Ch2 and Ch3 were connected to A5, A4 and A3 respectively.  The light following in our robot, was done using voltage divider circuit with two LDRs and connected to the analogue pins. The ultrasonic distance sensor</w:t>
-      </w:r>
-      <w:r>
-        <w:t xml:space="preserve"> sends out high-frequency sounds, which are converted into distance through the code. </w:t>
-      </w:r>
-      <w:r>
-        <w:t xml:space="preserve">It had 4 pins: Trig, Echo, GND and VCC. These were connected to digital pin 11, digital pin 12, GND and 5V. </w:t>
-      </w:r>
-      <w:r>
-        <w:t>We used this distance to create collision avoidance so when an object Infront of the sensor is detected it stops immediately until the object is removed or the buggy is moved.</w:t>
-      </w:r>
-      <w:r>
-        <w:t xml:space="preserve"> </w:t>
-      </w:r>
-      <w:r>
-        <w:t xml:space="preserve">We also added the I2C sensor, which detects light. </w:t>
+        <w:t xml:space="preserve">The main aim of our project was to make our buggy follow a line. The other features we included were collision avoidance and light-following. Most of the pins used were </w:t>
+      </w:r>
+      <w:proofErr w:type="spellStart"/>
+      <w:r>
+        <w:t>analog</w:t>
+      </w:r>
+      <w:proofErr w:type="spellEnd"/>
+      <w:r>
+        <w:t xml:space="preserve">, whereas the distance sensor used digital pins to work. </w:t>
+      </w:r>
+      <w:r>
+        <w:t xml:space="preserve">Our sensors were tested each time by uploading its respective code. </w:t>
       </w:r>
     </w:p>
     <w:p>
       <w:r>
-        <w:t>Final performance</w:t>
+        <w:t>System elements</w:t>
       </w:r>
     </w:p>
     <w:p>
       <w:r>
-        <w:t>The buggy can move on a black</w:t>
-      </w:r>
-      <w:r>
-        <w:t xml:space="preserve"> </w:t>
-      </w:r>
-      <w:r>
-        <w:t>rectangle with sharp and rounded edges. It can successfully detect objects of different colours and stop. Sometimes the light-following does not work as intended</w:t>
-      </w:r>
-      <w:r>
-        <w:t xml:space="preserve">, </w:t>
-      </w:r>
-      <w:r>
-        <w:t>there is a delayed response with the following, possibly has to do with the LDR.</w:t>
+        <w:t xml:space="preserve">Our buggy has an IR sensor for line following, which is the main aim of our final project. It follows the line by taking in 3 different readings: outside of the line to the left, outside of the line to the right, and on the line. The IR sensor had 7 pins, 5 of which were connected the remaining two pins were for LDR which was already part of a voltage divider, all pins were connected using female-to-male wires to the breadboard and then to the Arduino using wires. The 5V pin was connected to the 5V pin on the Arduino, GND was to GND. Ch1, Ch2 and Ch3 were connected to A5, A4 and A3 respectively.  The light following in our robot, was done using voltage divider circuit with two LDRs and connected to the analogue pins. The ultrasonic distance sensor sends out high-frequency sounds, which are converted into distance through the code. </w:t>
+      </w:r>
+      <w:r>
+        <w:t xml:space="preserve">It had 4 pins: Trig, Echo, GND and VCC. These were connected to digital pin 11, digital pin 12, GND and 5V. </w:t>
+      </w:r>
+      <w:r>
+        <w:t xml:space="preserve">We used this distance to create collision avoidance so when an object Infront of the sensor is detected it stops immediately until the object is removed or the buggy is moved. We also added the I2C sensor, which detects light. </w:t>
       </w:r>
     </w:p>
     <w:p>
       <w:r>
-        <w:t>Conclusions</w:t>
+        <w:t>Final performance</w:t>
       </w:r>
     </w:p>
     <w:p>
       <w:r>
+        <w:t>The buggy can move on a black</w:t>
+      </w:r>
+      <w:r>
+        <w:t xml:space="preserve"> </w:t>
+      </w:r>
+      <w:r>
+        <w:t>rectangle with sharp and rounded edges. It can successfully detect objects of different colours and stop. Sometimes the light-following does not work as intended</w:t>
+      </w:r>
+      <w:r>
+        <w:t xml:space="preserve">, </w:t>
+      </w:r>
+      <w:r>
+        <w:t>there is a delayed response with the following, possibly has to do with the LDR.</w:t>
+      </w:r>
+    </w:p>
+    <w:p>
+      <w:r>
+        <w:t>Conclusions</w:t>
+      </w:r>
+    </w:p>
+    <w:p>
+      <w:r>
         <w:t xml:space="preserve">All sensors work as intended. The only issue being most require the same number of pins, which our Arduino cannot accommodate at the same time. Some of the wires had to be removed for other sensors to work. </w:t>
       </w:r>
       <w:r>
         <w:t>Since all sensors used their own code to be functional, each time our sensor was being tested we had to reupload code after changes were made, or different code for different sensors were uploaded.</w:t>
+      </w:r>
+      <w:r>
+        <w:t xml:space="preserve"> Our wheels were also slower due to the friction between the floor and the rubber wheels. </w:t>
       </w:r>
     </w:p>
     <w:p/>

</xml_diff>

<commit_message>
Added more stuff to conclusion
I think some of it should be in final performance im not sure
</commit_message>
<xml_diff>
--- a/Final Report.docx
+++ b/Final Report.docx
@@ -426,13 +426,48 @@
     </w:p>
     <w:p>
       <w:r>
-        <w:t xml:space="preserve">Our buggy has an IR sensor for line following, which is the main aim of our final project. It follows the line by taking in 3 different readings: outside of the line to the left, outside of the line to the right, and on the line. The IR sensor had 7 pins, 5 of which were connected the remaining two pins were for LDR which was already part of a voltage divider, all pins were connected using female-to-male wires to the breadboard and then to the Arduino using wires. The 5V pin was connected to the 5V pin on the Arduino, GND was to GND. Ch1, Ch2 and Ch3 were connected to A5, A4 and A3 respectively.  The light following in our robot, was done using voltage divider circuit with two LDRs and connected to the analogue pins. The ultrasonic distance sensor sends out high-frequency sounds, which are converted into distance through the code. </w:t>
-      </w:r>
-      <w:r>
-        <w:t xml:space="preserve">It had 4 pins: Trig, Echo, GND and VCC. These were connected to digital pin 11, digital pin 12, GND and 5V. </w:t>
+        <w:t xml:space="preserve">Our buggy has an IR sensor for line following, which is the main aim of our final project. It follows the line by taking in 3 different readings: outside of the line to the left, outside of the line to the right, and on the line. The IR sensor had 7 pins, 5 of which were connected the remaining two pins were for LDR which was already part of a voltage divider, all pins were connected using female-to-male wires to the breadboard and then to the Arduino using wires. The 5V pin was connected to the 5V pin on the Arduino, GND was to GND. Ch1, Ch2 and Ch3 were connected to A5, A4 and A3 respectively.  The light following in our robot, was done using voltage divider circuit with two LDRs and connected to the analogue pins. </w:t>
+      </w:r>
+      <w:r>
+        <w:t xml:space="preserve">The Ultrasonic Distance sensor sends out a high frequency sound wave which hits objects and measures the time taken for it to reach back. This data can then be used to find the distance of objects. </w:t>
+      </w:r>
+      <w:r>
+        <w:t>It ha</w:t>
+      </w:r>
+      <w:r>
+        <w:t>s</w:t>
+      </w:r>
+      <w:r>
+        <w:t xml:space="preserve"> 4 pins: Trig, Echo, GND and VCC. These were connected to digital pin 11, digital pin 12, GND and 5V. </w:t>
       </w:r>
       <w:r>
         <w:t xml:space="preserve">We used this distance to create collision avoidance so when an object Infront of the sensor is detected it stops immediately until the object is removed or the buggy is moved. We also added the I2C sensor, which detects light. </w:t>
+      </w:r>
+      <w:r>
+        <w:t xml:space="preserve">The code detects an object with 0 to 25cm and sets the motor speed to “low”, which makes the buggy stop. </w:t>
+      </w:r>
+      <w:r>
+        <w:t>We also made our MAX44</w:t>
+      </w:r>
+      <w:r>
+        <w:t>009 I2C sensor work</w:t>
+      </w:r>
+      <w:r>
+        <w:t xml:space="preserve">, it used </w:t>
+      </w:r>
+      <w:proofErr w:type="spellStart"/>
+      <w:r>
+        <w:t>analog</w:t>
+      </w:r>
+      <w:proofErr w:type="spellEnd"/>
+      <w:r>
+        <w:t xml:space="preserve"> pins A4 and A5 which means we had to disconnect wires for </w:t>
+      </w:r>
+      <w:r>
+        <w:t>our IR sensor</w:t>
+      </w:r>
+      <w:r>
+        <w:t xml:space="preserve">. It would give out lux values when connected to a PC or laptop, with the appropriate amount of light. </w:t>
       </w:r>
     </w:p>
     <w:p/>
@@ -452,16 +487,25 @@
         <w:t xml:space="preserve"> </w:t>
       </w:r>
       <w:r>
-        <w:t>rectangle with sharp and rounded edges. It can successfully detect objects of different colours and stop. Sometimes the light-following does not work as intended</w:t>
-      </w:r>
-      <w:r>
-        <w:t xml:space="preserve">, </w:t>
-      </w:r>
-      <w:r>
-        <w:t>there is a delayed response with the following, possibly has to do with the LDR.</w:t>
-      </w:r>
-      <w:r>
-        <w:t xml:space="preserve"> </w:t>
+        <w:t xml:space="preserve">rectangle with sharp and rounded edges. It can successfully detect objects of different colours and stop. </w:t>
+      </w:r>
+      <w:r>
+        <w:t>The light-following feature works as intended and our buggy turns in the direction of a major source of light.</w:t>
+      </w:r>
+      <w:r>
+        <w:t xml:space="preserve"> Our ultrasonic distance successfully detected objects and avoided collision.</w:t>
+      </w:r>
+      <w:r>
+        <w:t xml:space="preserve"> As we did these tests, we noticed that our right wheel was much slower than</w:t>
+      </w:r>
+      <w:r>
+        <w:t xml:space="preserve"> the</w:t>
+      </w:r>
+      <w:r>
+        <w:t xml:space="preserve"> left wheel, this probably has to do with </w:t>
+      </w:r>
+      <w:r>
+        <w:t>some mechanical problem with the motor.</w:t>
       </w:r>
     </w:p>
     <w:p/>
@@ -479,6 +523,37 @@
       </w:r>
       <w:r>
         <w:t>Since all sensors used their own code to be functional, each time our sensor was being tested we had to reupload code after changes were made, or different code for different sensors were uploaded.</w:t>
+      </w:r>
+      <w:r>
+        <w:t xml:space="preserve"> At first there were issues with the speed of the buggy, when it came to line following </w:t>
+      </w:r>
+      <w:r>
+        <w:t>the speed had to be lowered from 150 to</w:t>
+      </w:r>
+      <w:r>
+        <w:t xml:space="preserve"> 140 as it was moving too fast for the IR sensor to </w:t>
+      </w:r>
+      <w:r>
+        <w:lastRenderedPageBreak/>
+        <w:t>detect the line.</w:t>
+      </w:r>
+      <w:r>
+        <w:t xml:space="preserve"> The same was for the collision avoidance, our buggy would </w:t>
+      </w:r>
+      <w:r>
+        <w:t>bump into the object before it had time to detect it. The error values were changed to make the line following smoother</w:t>
+      </w:r>
+      <w:r>
+        <w:t xml:space="preserve">, when it came to updating the </w:t>
+      </w:r>
+      <w:r>
+        <w:t>direction,</w:t>
+      </w:r>
+      <w:r>
+        <w:t xml:space="preserve"> it was headed</w:t>
+      </w:r>
+      <w:r>
+        <w:t>.</w:t>
       </w:r>
     </w:p>
     <w:p/>

</xml_diff>

<commit_message>
Added more content to line-following
</commit_message>
<xml_diff>
--- a/Final Report.docx
+++ b/Final Report.docx
@@ -403,7 +403,10 @@
         <w:t>some</w:t>
       </w:r>
       <w:r>
-        <w:t xml:space="preserve"> extra tasks given, these tasks were collision avoidance, bodywork, neatness of wiring and following a rectangular circuit</w:t>
+        <w:t xml:space="preserve"> extra tasks given, these tasks were collision avoidance, bodywork, neatness of wiring and following a rectangular </w:t>
+      </w:r>
+      <w:r>
+        <w:t>path</w:t>
       </w:r>
       <w:r>
         <w:t xml:space="preserve"> instead of the </w:t>
@@ -412,7 +415,13 @@
         <w:t>rounded rectangular</w:t>
       </w:r>
       <w:r>
-        <w:t xml:space="preserve"> circuit. </w:t>
+        <w:t xml:space="preserve"> </w:t>
+      </w:r>
+      <w:r>
+        <w:t>path</w:t>
+      </w:r>
+      <w:r>
+        <w:t xml:space="preserve">. </w:t>
       </w:r>
     </w:p>
     <w:p/>
@@ -426,7 +435,91 @@
     </w:p>
     <w:p>
       <w:r>
-        <w:t xml:space="preserve">Our buggy has an IR sensor for line following, which is the main aim of our final project. It follows the line by taking in 3 different readings: outside of the line to the left, outside of the line to the right, and on the line. The IR sensor had 7 pins, 5 of which were connected the remaining two pins were for LDR which was already part of a voltage divider, all pins were connected using female-to-male wires to the breadboard and then to the Arduino using wires. The 5V pin was connected to the 5V pin on the Arduino, GND was to GND. Ch1, Ch2 and Ch3 were connected to A5, A4 and A3 respectively.  The light following in our robot, was done using voltage divider circuit with two LDRs and connected to the analogue pins. </w:t>
+        <w:t xml:space="preserve">Our buggy has an IR sensor for line following, which is the main aim of our final project. It follows the line by taking in 3 different readings: outside of the line to the left, outside of the line to the right, and on the line. </w:t>
+      </w:r>
+      <w:r>
+        <w:t>The code</w:t>
+      </w:r>
+      <w:r>
+        <w:t xml:space="preserve"> takes in the reading in binary and </w:t>
+      </w:r>
+      <w:r>
+        <w:t xml:space="preserve">depending on what part of the line </w:t>
+      </w:r>
+      <w:r>
+        <w:t>it’s</w:t>
+      </w:r>
+      <w:r>
+        <w:t xml:space="preserve"> on, it sets a respective error value.</w:t>
+      </w:r>
+      <w:r>
+        <w:t xml:space="preserve"> </w:t>
+      </w:r>
+      <w:r>
+        <w:t>This error value tells the code how far off the line the buggy is.</w:t>
+      </w:r>
+    </w:p>
+    <w:p>
+      <w:r>
+        <w:t xml:space="preserve">Error values range from -180 to 180, however we set ours </w:t>
+      </w:r>
+      <w:r>
+        <w:t>from</w:t>
+      </w:r>
+      <w:r>
+        <w:t xml:space="preserve"> </w:t>
+      </w:r>
+      <w:r>
+        <w:t xml:space="preserve">-120 to 120. </w:t>
+      </w:r>
+      <w:r>
+        <w:t xml:space="preserve"> </w:t>
+      </w:r>
+      <w:r>
+        <w:t xml:space="preserve">For example: If the </w:t>
+      </w:r>
+      <w:r>
+        <w:t xml:space="preserve">sensor is detecting left side of the line, </w:t>
+      </w:r>
+      <w:r>
+        <w:t>its binary reading is B100 and its error value is set to -120.</w:t>
+      </w:r>
+      <w:r>
+        <w:t xml:space="preserve"> Once this is set, it checks if the error value is less than 0 or more. If its</w:t>
+      </w:r>
+      <w:r>
+        <w:t xml:space="preserve"> less than 0, than it turns to the right</w:t>
+      </w:r>
+      <w:r>
+        <w:t xml:space="preserve"> by setting the left wheel speed to a greater value</w:t>
+      </w:r>
+      <w:r>
+        <w:t xml:space="preserve"> (maximum speed + error value)</w:t>
+      </w:r>
+      <w:r>
+        <w:t xml:space="preserve"> and the right wheel to </w:t>
+      </w:r>
+      <w:r>
+        <w:t>maximum speed</w:t>
+      </w:r>
+      <w:r>
+        <w:t>. Similarly</w:t>
+      </w:r>
+      <w:r>
+        <w:t xml:space="preserve">, if its more than </w:t>
+      </w:r>
+      <w:r>
+        <w:t>or equal to 0, the right wheel is set</w:t>
+      </w:r>
+    </w:p>
+    <w:p>
+      <w:r>
+        <w:t xml:space="preserve">The IR sensor had 7 pins, 5 of which were connected the remaining two pins were for LDR which was already part of a voltage divider, all pins were connected using female-to-male wires to the breadboard and then to the Arduino using wires. The 5V pin was connected to the 5V pin on the Arduino, GND was to GND. Ch1, Ch2 and Ch3 were connected to A5, A4 and A3 respectively.  </w:t>
+      </w:r>
+    </w:p>
+    <w:p>
+      <w:r>
+        <w:t xml:space="preserve">The light following in our robot, was done using voltage divider circuit with two LDRs and connected to the analogue pins. </w:t>
       </w:r>
       <w:r>
         <w:t xml:space="preserve">The Ultrasonic Distance sensor sends out a high frequency sound wave which hits objects and measures the time taken for it to reach back. This data can then be used to find the distance of objects. </w:t>
@@ -453,15 +546,7 @@
         <w:t>009 I2C sensor work</w:t>
       </w:r>
       <w:r>
-        <w:t xml:space="preserve">, it used </w:t>
-      </w:r>
-      <w:proofErr w:type="spellStart"/>
-      <w:r>
-        <w:t>analog</w:t>
-      </w:r>
-      <w:proofErr w:type="spellEnd"/>
-      <w:r>
-        <w:t xml:space="preserve"> pins A4 and A5 which means we had to disconnect wires for </w:t>
+        <w:t xml:space="preserve">, it used analog pins A4 and A5 which means we had to disconnect wires for </w:t>
       </w:r>
       <w:r>
         <w:t>our IR sensor</w:t>
@@ -507,7 +592,36 @@
       <w:r>
         <w:t>some mechanical problem with the motor.</w:t>
       </w:r>
+      <w:r>
+        <w:t xml:space="preserve"> </w:t>
+      </w:r>
+      <w:r>
+        <w:t>All sensors work as intended. Th</w:t>
+      </w:r>
+      <w:r>
+        <w:t>e</w:t>
+      </w:r>
+      <w:r>
+        <w:t xml:space="preserve"> issue </w:t>
+      </w:r>
+      <w:r>
+        <w:t>is</w:t>
+      </w:r>
+      <w:r>
+        <w:t xml:space="preserve"> mos</w:t>
+      </w:r>
+      <w:r>
+        <w:t>t sensors</w:t>
+      </w:r>
+      <w:r>
+        <w:t xml:space="preserve"> require the same number of pins, which our Arduino </w:t>
+      </w:r>
+      <w:r>
+        <w:lastRenderedPageBreak/>
+        <w:t>cannot accommodate at the same time. Some of the wires had to be removed for other sensors to work. Since all sensors used their own code to be functional, each time our sensor was being tested we had to reupload code after changes were made, or different code for different sensors were uploaded. At first there were issues with the speed of the buggy, when it came to line following the speed had to be lowered from 150 to 140 as it was moving too fast for the IR sensor to detect the line. The same was for the collision avoidance, our buggy would bump into the object before it had time to detect it. The error values were changed to make the line following smoother, when it came to updating the direction, it was headed.</w:t>
+      </w:r>
     </w:p>
+    <w:p/>
     <w:p/>
     <w:p>
       <w:pPr>
@@ -515,45 +629,6 @@
       </w:pPr>
       <w:r>
         <w:t>Conclusions</w:t>
-      </w:r>
-    </w:p>
-    <w:p>
-      <w:r>
-        <w:t xml:space="preserve">All sensors work as intended. The only issue being most require the same number of pins, which our Arduino cannot accommodate at the same time. Some of the wires had to be removed for other sensors to work. </w:t>
-      </w:r>
-      <w:r>
-        <w:t>Since all sensors used their own code to be functional, each time our sensor was being tested we had to reupload code after changes were made, or different code for different sensors were uploaded.</w:t>
-      </w:r>
-      <w:r>
-        <w:t xml:space="preserve"> At first there were issues with the speed of the buggy, when it came to line following </w:t>
-      </w:r>
-      <w:r>
-        <w:t>the speed had to be lowered from 150 to</w:t>
-      </w:r>
-      <w:r>
-        <w:t xml:space="preserve"> 140 as it was moving too fast for the IR sensor to </w:t>
-      </w:r>
-      <w:r>
-        <w:lastRenderedPageBreak/>
-        <w:t>detect the line.</w:t>
-      </w:r>
-      <w:r>
-        <w:t xml:space="preserve"> The same was for the collision avoidance, our buggy would </w:t>
-      </w:r>
-      <w:r>
-        <w:t>bump into the object before it had time to detect it. The error values were changed to make the line following smoother</w:t>
-      </w:r>
-      <w:r>
-        <w:t xml:space="preserve">, when it came to updating the </w:t>
-      </w:r>
-      <w:r>
-        <w:t>direction,</w:t>
-      </w:r>
-      <w:r>
-        <w:t xml:space="preserve"> it was headed</w:t>
-      </w:r>
-      <w:r>
-        <w:t>.</w:t>
       </w:r>
     </w:p>
     <w:p/>
@@ -1172,6 +1247,7 @@
   <w:style w:type="character" w:default="1" w:styleId="DefaultParagraphFont">
     <w:name w:val="Default Paragraph Font"/>
     <w:uiPriority w:val="1"/>
+    <w:semiHidden/>
     <w:unhideWhenUsed/>
   </w:style>
   <w:style w:type="table" w:default="1" w:styleId="TableNormal">

</xml_diff>

<commit_message>
Done w the report
</commit_message>
<xml_diff>
--- a/Final Report.docx
+++ b/Final Report.docx
@@ -546,6 +546,11 @@
       </w:r>
     </w:p>
     <w:p>
+      <w:pPr>
+        <w:rPr>
+          <w:rFonts w:cstheme="minorHAnsi"/>
+        </w:rPr>
+      </w:pPr>
       <w:r>
         <w:t>The IR sensor had 7 pins, 5 of which were connected the remaining two pins were for LDR which was already part of a voltage divider</w:t>
       </w:r>
@@ -553,59 +558,62 @@
         <w:t xml:space="preserve"> circuit</w:t>
       </w:r>
       <w:r>
-        <w:t xml:space="preserve">, all pins were connected using female-to-male wires to the breadboard and then to the Arduino using wires. The 5V pin was connected to the 5V pin on the Arduino, GND was to GND. Ch1, Ch2 and Ch3 were connected to A5, A4 and A3 respectively.  </w:t>
+        <w:t xml:space="preserve">, all pins were connected using female-to-male wires to the breadboard and then to the Arduino using wires. The 5V pin was connected to the 5V pin on the </w:t>
+      </w:r>
+      <w:r>
+        <w:rPr>
+          <w:rFonts w:cstheme="minorHAnsi"/>
+        </w:rPr>
+        <w:t xml:space="preserve">Arduino, GND was to GND. Ch1, Ch2 and Ch3 were connected to A5, A4 and A3 respectively.  </w:t>
       </w:r>
     </w:p>
     <w:p>
       <w:pPr>
         <w:rPr>
-          <w:rFonts w:ascii="Aptos Narrow" w:hAnsi="Aptos Narrow"/>
+          <w:rFonts w:cstheme="minorHAnsi"/>
         </w:rPr>
       </w:pPr>
       <w:r>
+        <w:rPr>
+          <w:rFonts w:cstheme="minorHAnsi"/>
+        </w:rPr>
         <w:t>The light following in our robot, was done using</w:t>
       </w:r>
       <w:r>
+        <w:rPr>
+          <w:rFonts w:cstheme="minorHAnsi"/>
+        </w:rPr>
         <w:t xml:space="preserve"> two</w:t>
       </w:r>
       <w:r>
+        <w:rPr>
+          <w:rFonts w:cstheme="minorHAnsi"/>
+        </w:rPr>
         <w:t xml:space="preserve"> </w:t>
       </w:r>
       <w:r>
+        <w:rPr>
+          <w:rFonts w:cstheme="minorHAnsi"/>
+        </w:rPr>
         <w:t>LDR voltage divider circuits</w:t>
       </w:r>
       <w:r>
+        <w:rPr>
+          <w:rFonts w:cstheme="minorHAnsi"/>
+        </w:rPr>
         <w:t>,</w:t>
       </w:r>
       <w:r>
-        <w:t xml:space="preserve"> there is one circuit on each side of the buggy. The circuits consist of one 10K</w:t>
-      </w:r>
-      <w:r>
         <w:rPr>
-          <w:rFonts w:ascii="Aptos Narrow" w:hAnsi="Aptos Narrow"/>
+          <w:rFonts w:cstheme="minorHAnsi"/>
         </w:rPr>
-        <w:t>Ω</w:t>
-      </w:r>
-      <w:r>
-        <w:t xml:space="preserve"> resistor and one LDR (Light Dependent Resistor) with a resistance range of about 100</w:t>
+        <w:t xml:space="preserve"> there is one circuit on each side of the buggy. The circuits consist of one 10KΩ resistor and one LDR (Light Dependent Resistor) with a resistance range of about 100Ω </w:t>
       </w:r>
       <w:r>
         <w:rPr>
-          <w:rFonts w:ascii="Aptos Narrow" w:hAnsi="Aptos Narrow"/>
+          <w:rFonts w:cstheme="minorHAnsi"/>
         </w:rPr>
-        <w:t>Ω</w:t>
-      </w:r>
-      <w:r>
-        <w:t xml:space="preserve"> </w:t>
-      </w:r>
-      <w:r>
-        <w:t>– 10K</w:t>
-      </w:r>
-      <w:r>
-        <w:rPr>
-          <w:rFonts w:ascii="Aptos Narrow" w:hAnsi="Aptos Narrow"/>
-        </w:rPr>
-        <w:t>Ω. An LDR is a resistor which changes resistance depending on the light levels so that when light is directed onto the LDR it will drop in resistance and when there is no light the resistance will rise. A voltage divider circuit is a common electrical circuit which consists of two resistors, an input voltage and an output voltage if one of the resistors is changed for an LDR the output voltage changes as the light levels change. We have connected both LDR voltage divider circuits to the Arduino on our robot the left circuit goes to A0 and the right to A1, these analogue pins on the Arduino can read the voltage outputted by the LDR voltage divider circuit. There is then code uploaded to the Arduino to tell it what to do when it reads certain voltages so that it can turn left or right depending on where the light source is coming from. We have the circuits set up so that when light is directed to one side of the robot the voltage output will rise which the Arduino then reads and sends a PWM signal to the motors which then results in the turning of the robot.</w:t>
+        <w:t>– 10KΩ. An LDR is a resistor which changes resistance depending on the light levels so that when light is directed onto the LDR it will drop in resistance and when there is no light the resistance will rise. A voltage divider circuit is a common electrical circuit which consists of two resistors, an input voltage and an output voltage if one of the resistors is changed for an LDR the output voltage changes as the light levels change. We have connected both LDR voltage divider circuits to the Arduino on our robot the left circuit goes to A0 and the right to A1, these analogue pins on the Arduino can read the voltage outputted by the LDR voltage divider circuit. There is then code uploaded to the Arduino to tell it what to do when it reads certain voltages so that it can turn left or right depending on where the light source is coming from. We have the circuits set up so that when light is directed to one side of the robot the voltage output will rise which the Arduino then reads and sends a PWM signal to the motors which then results in the turning of the robot.</w:t>
       </w:r>
     </w:p>
     <w:p>
@@ -613,29 +621,25 @@
         <w:t xml:space="preserve">The Ultrasonic Distance sensor sends out a high frequency sound wave which hits objects and measures the time taken for it to reach back. This data </w:t>
       </w:r>
       <w:r>
-        <w:t xml:space="preserve">is then sent to the microcontroller (Arduino) which using the code uploaded calculates the distance of the object away from the sensor, from the time taken for the wave to bounce off the object. </w:t>
-      </w:r>
-      <w:r>
-        <w:t xml:space="preserve">We used this distance to create collision avoidance, </w:t>
+        <w:t xml:space="preserve">is then sent to the microcontroller (Arduino) which using the code uploaded calculates the distance of the object away from the sensor, from the </w:t>
       </w:r>
       <w:r>
         <w:lastRenderedPageBreak/>
-        <w:t xml:space="preserve">so when an object Infront of the sensor is detected, it stops immediately until the object is removed or the buggy is moved. </w:t>
-      </w:r>
-      <w:r>
-        <w:t xml:space="preserve">This code uses a new library called NewPing which sets up the trig pin, echo pin and the maximum distance it can detect. </w:t>
-      </w:r>
-      <w:r>
-        <w:t xml:space="preserve">The maximum distance the sensor can detect is 200cm. </w:t>
-      </w:r>
-      <w:r>
-        <w:t xml:space="preserve">The code detects an object within 0 to 25cm and sets the motor speed to “low”, which makes the buggy stop. </w:t>
-      </w:r>
-      <w:r>
-        <w:t>Otherwise,</w:t>
-      </w:r>
-      <w:r>
-        <w:t xml:space="preserve"> it keeps moving, using the spin and wait function for our motors.</w:t>
+        <w:t xml:space="preserve">time taken for the wave to bounce off the object. We used this distance to create collision avoidance, so when an object Infront of the sensor is detected, it stops immediately until the object is removed or the buggy is moved. </w:t>
+      </w:r>
+      <w:r>
+        <w:t xml:space="preserve">This code uses a new library called </w:t>
+      </w:r>
+      <w:proofErr w:type="spellStart"/>
+      <w:r>
+        <w:t>NewPing</w:t>
+      </w:r>
+      <w:proofErr w:type="spellEnd"/>
+      <w:r>
+        <w:t xml:space="preserve"> which sets up the trig pin, echo pin and the maximum distance it can detect. The maximum distance the sensor can detect is 200cm. </w:t>
+      </w:r>
+      <w:r>
+        <w:t>The code detects an object within 0 to 25cm and sets the motor speed to “low”, which makes the buggy stop. Otherwise, it keeps moving, using the spin and wait function for our motors.</w:t>
       </w:r>
       <w:r>
         <w:t xml:space="preserve"> </w:t>
@@ -762,10 +766,7 @@
       <w:r>
         <w:t xml:space="preserve">When it came to the wiring, most sensors used the same pins, which meant a lot of them had to be removed for another sensor to work. There was a problem with two sensors specifically, the distance sensor and the I2C sensor getting in the way of each other which was swiftly fixed with organized wiring, also the distance sensor falling off the buggy which was fixed with an adhesive. </w:t>
       </w:r>
-    </w:p>
-    <w:p>
-      <w:r>
-        <w:lastRenderedPageBreak/>
+      <w:r>
         <w:t>This project showed the integration of various sensors in one robot, and the implementation of software and hardware together. It also showed the importance of debugging and testing systems continuously until improved.</w:t>
       </w:r>
     </w:p>

</xml_diff>